<commit_message>
NOVA checkpoint before complete artifact generation pipeline
</commit_message>
<xml_diff>
--- a/backend/app/workspace/output/cybersecurity.docx
+++ b/backend/app/workspace/output/cybersecurity.docx
@@ -19,7 +19,7 @@
     <w:p/>
     <w:p>
       <w:r>
-        <w:t>Cybersecurity is a critical aspect of protecting digital assets and maintaining privacy in today's interconnected world. It involves safeguarding computer systems, networks, and data from unauthorized access, theft, or damage. The goal of cybersecurity is to ensure that sensitive information remains confidential, integrity, and available only to authorized users.</w:t>
+        <w:t>Cybersecurity is a critical aspect of protecting digital assets and maintaining privacy in today's interconnected world. It involves safeguarding information, systems, networks, and devices from unauthorized access, theft, or damage. The goal of cybersecurity is to ensure that sensitive data remains confidential, integrity, and available only to authorized users.</w:t>
       </w:r>
     </w:p>
     <w:p/>
@@ -38,17 +38,17 @@
         <w:pStyle w:val="ListNumber"/>
       </w:pPr>
       <w:r>
-        <w:t>**Data Protection**: Protects personal information such as financial details, health records, and personal communications.</w:t>
+        <w:t>**Data Protection**: Protects personal information, financial details, and intellectual property from cyber threats.</w:t>
       </w:r>
     </w:p>
     <w:p>
       <w:r>
-        <w:t>2. **Business Continuity**: Ensures that critical business operations are not disrupted by cyber threats.</w:t>
+        <w:t>2. **Business Continuity**: Ensures that critical business operations are not disrupted by security breaches.</w:t>
       </w:r>
     </w:p>
     <w:p>
       <w:r>
-        <w:t>3. **Reputation Management**: Maintains a positive public image and prevents damage to the company's reputation due to data breaches or security incidents.</w:t>
+        <w:t>3. **Reputation Management**: Maintains a positive reputation in the eyes of customers and stakeholders.</w:t>
       </w:r>
     </w:p>
     <w:p/>
@@ -67,17 +67,17 @@
         <w:pStyle w:val="ListNumber"/>
       </w:pPr>
       <w:r>
-        <w:t>**Access Control**: Restricts access to systems, networks, and data based on user roles and permissions.</w:t>
+        <w:t>**Access Control**: Restricts access to systems, data, and resources based on user roles and permissions.</w:t>
       </w:r>
     </w:p>
     <w:p>
       <w:r>
-        <w:t>2. **Encryption**: Protects data in transit and at rest by converting it into a coded form that can only be deciphered with the correct key.</w:t>
+        <w:t>2. **Encryption**: Converts data into a coded form that can only be read by authorized individuals or systems.</w:t>
       </w:r>
     </w:p>
     <w:p>
       <w:r>
-        <w:t>3. **Firewalls**: Blocks unauthorized traffic from entering or leaving an organization's network.</w:t>
+        <w:t>3. **Firewalls**: Acts as barriers between internal networks and external threats, monitoring and controlling incoming and outgoing traffic.</w:t>
       </w:r>
     </w:p>
     <w:p>
@@ -101,22 +101,22 @@
         <w:pStyle w:val="ListNumber"/>
       </w:pPr>
       <w:r>
-        <w:t>**Phishing**: Attempts to trick individuals into providing sensitive information by posing as a trustworthy entity.</w:t>
+        <w:t>**Phishing Attacks**: Attempts to trick individuals into providing sensitive information through fraudulent emails or messages.</w:t>
       </w:r>
     </w:p>
     <w:p>
       <w:r>
-        <w:t>2. **Malware**: Includes viruses, worms, trojans, spyware, and ransomware that can harm systems or steal data.</w:t>
+        <w:t>2. **Malware Infections**: Includes viruses, worms, trojans, and ransomware that can harm systems and steal data.</w:t>
       </w:r>
     </w:p>
     <w:p>
       <w:r>
-        <w:t>3. **DDoS Attacks**: Distracts or overwhelms network resources to disrupt services.</w:t>
+        <w:t>3. **DDoS Attacks**: Distracts network resources by overwhelming them with traffic from multiple sources.</w:t>
       </w:r>
     </w:p>
     <w:p>
       <w:r>
-        <w:t>4. **Man-in-the-Middle (MitM) Attacks**: Intercepts communications between two parties to eavesdrop on or alter them.</w:t>
+        <w:t>4. **Insider Threats**: Unauthorized access to systems by employees or contractors who have legitimate access.</w:t>
       </w:r>
     </w:p>
     <w:p/>
@@ -135,56 +135,22 @@
         <w:pStyle w:val="ListNumber"/>
       </w:pPr>
       <w:r>
-        <w:t>**Employee Training and Awareness**: Educates employees about security best practices, phishing techniques, and the importance of reporting suspicious activities.</w:t>
+        <w:t>**Employee Training**: Educates employees about security best practices and the importance of reporting suspicious activities.</w:t>
       </w:r>
     </w:p>
     <w:p>
       <w:r>
-        <w:t>2. **Strong Password Policies**: Enforces strong, unique passwords and requires regular password changes.</w:t>
+        <w:t>2. **Regular Security Audits**: Conducts periodic assessments to identify vulnerabilities and weaknesses in systems.</w:t>
       </w:r>
     </w:p>
     <w:p>
       <w:r>
-        <w:t>3. **Regular Security Audits**: Conducts periodic assessments to identify vulnerabilities and weaknesses in systems and networks.</w:t>
+        <w:t>3. **Incident Response Planning**: Develops a plan to respond quickly and effectively to security breaches or incidents.</w:t>
       </w:r>
     </w:p>
     <w:p>
       <w:r>
-        <w:t>4. **Incident Response Plan**: Develops a plan for responding to security incidents, including procedures for containment, recovery, and communication.</w:t>
-      </w:r>
-    </w:p>
-    <w:p/>
-    <w:p>
-      <w:pPr>
-        <w:pStyle w:val="Heading3"/>
-        <w:jc w:val="left"/>
-      </w:pPr>
-      <w:r>
-        <w:t>Tools and Technologies</w:t>
-      </w:r>
-    </w:p>
-    <w:p/>
-    <w:p>
-      <w:pPr>
-        <w:pStyle w:val="ListNumber"/>
-      </w:pPr>
-      <w:r>
-        <w:t>**Antivirus Software**: Protects against malware by scanning files for known threats.</w:t>
-      </w:r>
-    </w:p>
-    <w:p>
-      <w:r>
-        <w:t>2. **Firewall Software**: Blocks unauthorized access to systems and networks.</w:t>
-      </w:r>
-    </w:p>
-    <w:p>
-      <w:r>
-        <w:t>3. **Encryption Solutions**: Provides secure transmission of data over the internet.</w:t>
-      </w:r>
-    </w:p>
-    <w:p>
-      <w:r>
-        <w:t>4. **Security Information and Event Management (SIEM)**: Monitors network activity and alerts administrators to potential security incidents.</w:t>
+        <w:t>4. **Use of Multi-Factor Authentication (MFA)**: Adds an extra layer of security by requiring multiple forms of verification.</w:t>
       </w:r>
     </w:p>
     <w:p/>
@@ -200,7 +166,13 @@
     <w:p/>
     <w:p>
       <w:r>
-        <w:t>Cybersecurity is a multifaceted field that requires a combination of technical expertise, strong policies, and continuous monitoring. By implementing effective cybersecurity measures, organizations can protect their digital assets and maintain the trust of their customers and employees.</w:t>
+        <w:t>Cybersecurity is essential for protecting digital assets and maintaining privacy in today's interconnected world. By implementing strong access control, encryption, firewalls, and regular updates, organizations can reduce the risk of cyber threats and protect their sensitive data. Additionally, educating employees about security best practices and developing an incident response plan are crucial components of a comprehensive cybersecurity strategy.</w:t>
+      </w:r>
+    </w:p>
+    <w:p/>
+    <w:p>
+      <w:r>
+        <w:t>For more detailed information on specific cybersecurity measures and technologies, consult relevant resources or professionals in the field.</w:t>
       </w:r>
     </w:p>
     <w:sectPr>

</xml_diff>